<commit_message>
Welt 1: Tracetabellen nur mit Variablen, Codestellen markiert
Lab W1-L2-03, W1-L3-04 (Bedingungsspalte entfernt), Boss W1-B-07, Warm-up W0-03 (docx + Lab).

Co-Authored-By: Claude Opus 5.5 <noreply@anthropic.com>
Claude-Session: https://claude.ai/code/session_01CemoEYGRdCe5FszEBVFFUP
</commit_message>
<xml_diff>
--- a/materialien/Werkzeuge/Warm-up-Karten/AQ_Warm-up-Karten_W0-W1.docx
+++ b/materialien/Werkzeuge/Warm-up-Karten/AQ_Warm-up-Karten_W0-W1.docx
@@ -4613,7 +4613,7 @@
                 <w:sz w:val="21"/>
                 <w:szCs w:val="21"/>
               </w:rPr>
-              <w:t xml:space="preserve">Spalten: i | r[i] | r[i] &lt; a | a | b (erste Zeile: Werte vor der Schleife).</w:t>
+              <w:t xml:space="preserve">Spalten: i | r[i] | a | b – eine Zeile an jeder mit „// → Tabellenzeile“ markierten Stelle (erste Zeile: Werte vor der Schleife).</w:t>
             </w:r>
           </w:p>
           <w:p>
@@ -4720,19 +4720,14 @@
                     </w:rPr>
                     <w:t xml:space="preserve">    int b = 0;</w:t>
                   </w:r>
-                </w:p>
-                <w:p>
-                  <w:pPr>
-                    <w:keepNext/>
-                    <w:spacing w:after="0" w:before="0" w:line="240"/>
-                  </w:pPr>
                   <w:r>
                     <w:rPr>
                       <w:rFonts w:ascii="Consolas" w:cs="Consolas" w:eastAsia="Consolas" w:hAnsi="Consolas"/>
                       <w:sz w:val="19"/>
                       <w:szCs w:val="19"/>
-                    </w:rPr>
-                    <w:t xml:space="preserve">    for (int i = 1; i &lt; r.length; i++) {</w:t>
+                      <w:color w:val="5F7F5F"/>
+                    </w:rPr>
+                    <w:t xml:space="preserve">   // → Tabellenzeile (Startwerte)</w:t>
                   </w:r>
                 </w:p>
                 <w:p>
@@ -4746,7 +4741,7 @@
                       <w:sz w:val="19"/>
                       <w:szCs w:val="19"/>
                     </w:rPr>
-                    <w:t xml:space="preserve">        if (r[i] &lt; a) {</w:t>
+                    <w:t xml:space="preserve">    for (int i = 1; i &lt; r.length; i++) {</w:t>
                   </w:r>
                 </w:p>
                 <w:p>
@@ -4760,7 +4755,7 @@
                       <w:sz w:val="19"/>
                       <w:szCs w:val="19"/>
                     </w:rPr>
-                    <w:t xml:space="preserve">            a = r[i];</w:t>
+                    <w:t xml:space="preserve">        if (r[i] &lt; a) {</w:t>
                   </w:r>
                 </w:p>
                 <w:p>
@@ -4774,7 +4769,7 @@
                       <w:sz w:val="19"/>
                       <w:szCs w:val="19"/>
                     </w:rPr>
-                    <w:t xml:space="preserve">            b = i;</w:t>
+                    <w:t xml:space="preserve">            a = r[i];</w:t>
                   </w:r>
                 </w:p>
                 <w:p>
@@ -4788,7 +4783,30 @@
                       <w:sz w:val="19"/>
                       <w:szCs w:val="19"/>
                     </w:rPr>
+                    <w:t xml:space="preserve">            b = i;</w:t>
+                  </w:r>
+                </w:p>
+                <w:p>
+                  <w:pPr>
+                    <w:keepNext/>
+                    <w:spacing w:after="0" w:before="0" w:line="240"/>
+                  </w:pPr>
+                  <w:r>
+                    <w:rPr>
+                      <w:rFonts w:ascii="Consolas" w:cs="Consolas" w:eastAsia="Consolas" w:hAnsi="Consolas"/>
+                      <w:sz w:val="19"/>
+                      <w:szCs w:val="19"/>
+                    </w:rPr>
                     <w:t xml:space="preserve">        }</w:t>
+                  </w:r>
+                  <w:r>
+                    <w:rPr>
+                      <w:rFonts w:ascii="Consolas" w:cs="Consolas" w:eastAsia="Consolas" w:hAnsi="Consolas"/>
+                      <w:sz w:val="19"/>
+                      <w:szCs w:val="19"/>
+                      <w:color w:val="5F7F5F"/>
+                    </w:rPr>
+                    <w:t xml:space="preserve">   // → Tabellenzeile</w:t>
                   </w:r>
                 </w:p>
                 <w:p>
@@ -12119,105 +12137,105 @@
                 <w:sz w:val="19"/>
                 <w:szCs w:val="19"/>
               </w:rPr>
-              <w:t xml:space="preserve">i | r[i] | r[i] &lt; a | a | b</w:t>
-            </w:r>
-          </w:p>
-          <w:p>
-            <w:pPr>
-              <w:keepNext/>
-              <w:spacing w:after="0" w:before="0" w:line="240"/>
-            </w:pPr>
-            <w:r>
-              <w:rPr>
-                <w:rFonts w:ascii="Consolas" w:cs="Consolas" w:eastAsia="Consolas" w:hAnsi="Consolas"/>
-                <w:sz w:val="19"/>
-                <w:szCs w:val="19"/>
-              </w:rPr>
-              <w:t xml:space="preserve">--+------+----------+---+---</w:t>
-            </w:r>
-          </w:p>
-          <w:p>
-            <w:pPr>
-              <w:keepNext/>
-              <w:spacing w:after="0" w:before="0" w:line="240"/>
-            </w:pPr>
-            <w:r>
-              <w:rPr>
-                <w:rFonts w:ascii="Consolas" w:cs="Consolas" w:eastAsia="Consolas" w:hAnsi="Consolas"/>
-                <w:sz w:val="19"/>
-                <w:szCs w:val="19"/>
-              </w:rPr>
-              <w:t xml:space="preserve">- |  -   |    -     | 5 | 0</w:t>
-            </w:r>
-          </w:p>
-          <w:p>
-            <w:pPr>
-              <w:keepNext/>
-              <w:spacing w:after="0" w:before="0" w:line="240"/>
-            </w:pPr>
-            <w:r>
-              <w:rPr>
-                <w:rFonts w:ascii="Consolas" w:cs="Consolas" w:eastAsia="Consolas" w:hAnsi="Consolas"/>
-                <w:sz w:val="19"/>
-                <w:szCs w:val="19"/>
-              </w:rPr>
-              <w:t xml:space="preserve">1 |  8   |  falsch  | 5 | 0</w:t>
-            </w:r>
-          </w:p>
-          <w:p>
-            <w:pPr>
-              <w:keepNext/>
-              <w:spacing w:after="0" w:before="0" w:line="240"/>
-            </w:pPr>
-            <w:r>
-              <w:rPr>
-                <w:rFonts w:ascii="Consolas" w:cs="Consolas" w:eastAsia="Consolas" w:hAnsi="Consolas"/>
-                <w:sz w:val="19"/>
-                <w:szCs w:val="19"/>
-              </w:rPr>
-              <w:t xml:space="preserve">2 |  3   |  wahr    | 3 | 2</w:t>
-            </w:r>
-          </w:p>
-          <w:p>
-            <w:pPr>
-              <w:keepNext/>
-              <w:spacing w:after="0" w:before="0" w:line="240"/>
-            </w:pPr>
-            <w:r>
-              <w:rPr>
-                <w:rFonts w:ascii="Consolas" w:cs="Consolas" w:eastAsia="Consolas" w:hAnsi="Consolas"/>
-                <w:sz w:val="19"/>
-                <w:szCs w:val="19"/>
-              </w:rPr>
-              <w:t xml:space="preserve">3 |  6   |  falsch  | 3 | 2</w:t>
-            </w:r>
-          </w:p>
-          <w:p>
-            <w:pPr>
-              <w:keepNext/>
-              <w:spacing w:after="0" w:before="0" w:line="240"/>
-            </w:pPr>
-            <w:r>
-              <w:rPr>
-                <w:rFonts w:ascii="Consolas" w:cs="Consolas" w:eastAsia="Consolas" w:hAnsi="Consolas"/>
-                <w:sz w:val="19"/>
-                <w:szCs w:val="19"/>
-              </w:rPr>
-              <w:t xml:space="preserve">4 |  1   |  wahr    | 1 | 4</w:t>
-            </w:r>
-          </w:p>
-          <w:p>
-            <w:pPr>
-              <w:keepNext/>
-              <w:spacing w:after="0" w:before="0" w:line="240"/>
-            </w:pPr>
-            <w:r>
-              <w:rPr>
-                <w:rFonts w:ascii="Consolas" w:cs="Consolas" w:eastAsia="Consolas" w:hAnsi="Consolas"/>
-                <w:sz w:val="19"/>
-                <w:szCs w:val="19"/>
-              </w:rPr>
-              <w:t xml:space="preserve">5 |  4   |  falsch  | 1 | 4</w:t>
+              <w:t xml:space="preserve">i | r[i] | a | b</w:t>
+            </w:r>
+          </w:p>
+          <w:p>
+            <w:pPr>
+              <w:keepNext/>
+              <w:spacing w:after="0" w:before="0" w:line="240"/>
+            </w:pPr>
+            <w:r>
+              <w:rPr>
+                <w:rFonts w:ascii="Consolas" w:cs="Consolas" w:eastAsia="Consolas" w:hAnsi="Consolas"/>
+                <w:sz w:val="19"/>
+                <w:szCs w:val="19"/>
+              </w:rPr>
+              <w:t xml:space="preserve">--+------+---+---</w:t>
+            </w:r>
+          </w:p>
+          <w:p>
+            <w:pPr>
+              <w:keepNext/>
+              <w:spacing w:after="0" w:before="0" w:line="240"/>
+            </w:pPr>
+            <w:r>
+              <w:rPr>
+                <w:rFonts w:ascii="Consolas" w:cs="Consolas" w:eastAsia="Consolas" w:hAnsi="Consolas"/>
+                <w:sz w:val="19"/>
+                <w:szCs w:val="19"/>
+              </w:rPr>
+              <w:t xml:space="preserve">- |  -   | 5 | 0</w:t>
+            </w:r>
+          </w:p>
+          <w:p>
+            <w:pPr>
+              <w:keepNext/>
+              <w:spacing w:after="0" w:before="0" w:line="240"/>
+            </w:pPr>
+            <w:r>
+              <w:rPr>
+                <w:rFonts w:ascii="Consolas" w:cs="Consolas" w:eastAsia="Consolas" w:hAnsi="Consolas"/>
+                <w:sz w:val="19"/>
+                <w:szCs w:val="19"/>
+              </w:rPr>
+              <w:t xml:space="preserve">1 |  8   | 5 | 0</w:t>
+            </w:r>
+          </w:p>
+          <w:p>
+            <w:pPr>
+              <w:keepNext/>
+              <w:spacing w:after="0" w:before="0" w:line="240"/>
+            </w:pPr>
+            <w:r>
+              <w:rPr>
+                <w:rFonts w:ascii="Consolas" w:cs="Consolas" w:eastAsia="Consolas" w:hAnsi="Consolas"/>
+                <w:sz w:val="19"/>
+                <w:szCs w:val="19"/>
+              </w:rPr>
+              <w:t xml:space="preserve">2 |  3   | 3 | 2</w:t>
+            </w:r>
+          </w:p>
+          <w:p>
+            <w:pPr>
+              <w:keepNext/>
+              <w:spacing w:after="0" w:before="0" w:line="240"/>
+            </w:pPr>
+            <w:r>
+              <w:rPr>
+                <w:rFonts w:ascii="Consolas" w:cs="Consolas" w:eastAsia="Consolas" w:hAnsi="Consolas"/>
+                <w:sz w:val="19"/>
+                <w:szCs w:val="19"/>
+              </w:rPr>
+              <w:t xml:space="preserve">3 |  6   | 3 | 2</w:t>
+            </w:r>
+          </w:p>
+          <w:p>
+            <w:pPr>
+              <w:keepNext/>
+              <w:spacing w:after="0" w:before="0" w:line="240"/>
+            </w:pPr>
+            <w:r>
+              <w:rPr>
+                <w:rFonts w:ascii="Consolas" w:cs="Consolas" w:eastAsia="Consolas" w:hAnsi="Consolas"/>
+                <w:sz w:val="19"/>
+                <w:szCs w:val="19"/>
+              </w:rPr>
+              <w:t xml:space="preserve">4 |  1   | 1 | 4</w:t>
+            </w:r>
+          </w:p>
+          <w:p>
+            <w:pPr>
+              <w:keepNext/>
+              <w:spacing w:after="0" w:before="0" w:line="240"/>
+            </w:pPr>
+            <w:r>
+              <w:rPr>
+                <w:rFonts w:ascii="Consolas" w:cs="Consolas" w:eastAsia="Consolas" w:hAnsi="Consolas"/>
+                <w:sz w:val="19"/>
+                <w:szCs w:val="19"/>
+              </w:rPr>
+              <w:t xml:space="preserve">5 |  4   | 1 | 4</w:t>
             </w:r>
           </w:p>
         </w:tc>

</xml_diff>